<commit_message>
Protocolo de retirada: análise da proposta OMV/ANVETEM, versão 2
Versão 2 da análise, com as 45 notas manuscritas ao ficheiro anotado
integradas (Anexo III indica onde): terminologia legal, DL 315/2009,
organizações de voluntariado de proteção civil (LBPC, art. 46.º-A;
Portaria 91/2017), âmbito do DL 276/2001, responsável clínico com CAMV,
veterinário contratado pelo município, transporte (Reg. 1/2005, art. 1.º,
n.º 5), cadáveres (Reg. 1069/2009), mandado e triagem no socorro, entre
outras. Gerada por _analise_proposta_omv_anvetem_v2.py.

Avaliação das notas atualizada com os esclarecimentos de 14.10.2026.
v1.1: corrigida a contagem das situações-tipo do âmbito A.
Legislação vigente: Portaria 91/2017 e texto original do DL 142/2006.

Co-Authored-By: Claude Opus 5.5 <noreply@anthropic.com>
Claude-Session: https://claude.ai/code/session_01HVdseQDU3TzmMp7vD8ambZ
</commit_message>
<xml_diff>
--- a/Protocolo de retirada de alojamentos/Avaliacao_Notas_Proposta_OMV_ANVETEM.docx
+++ b/Protocolo de retirada de alojamentos/Avaliacao_Notas_Proposta_OMV_ANVETEM.docx
@@ -229,7 +229,7 @@
           <w:b w:val="0"/>
           <w:sz w:val="21"/>
         </w:rPr>
-        <w:t>As restantes notas novas (OVPC, terminologia, âmbito do DL 276/2001, socorro, veterinário contratado, transporte e as de menor peso) não foram integradas no texto da análise. Podem sê-lo numa versão 2, se for útil.</w:t>
+        <w:t>Todas as notas foram integradas na versão 2 da análise («Analise_Proposta_OMV_ANVETEM_Retirada_e_Socorro_v2.docx»), cujo Anexo III indica onde ficou cada uma.</w:t>
       </w:r>
     </w:p>
     <w:p>
@@ -2667,7 +2667,7 @@
               <w:rPr>
                 <w:sz w:val="17"/>
               </w:rPr>
-              <w:t>«276/2009 não se aplica a pecuária» (lido como 276/2001)</w:t>
+              <w:t>«276/2009 não se aplica a pecuária» (lido como 276/2001; confirmado em 14.10.2026)</w:t>
             </w:r>
           </w:p>
         </w:tc>
@@ -3806,7 +3806,7 @@
                 <w:b/>
                 <w:sz w:val="17"/>
               </w:rPr>
-              <w:t>Sim (1.ª parte)</w:t>
+              <w:t>Sim</w:t>
             </w:r>
           </w:p>
         </w:tc>
@@ -3843,7 +3843,7 @@
               <w:rPr>
                 <w:sz w:val="17"/>
               </w:rPr>
-              <w:t>1.ª parte: «indelegável» sem regra de substituição; numa operação longa o responsável clínico tem de ser substituível. 2.ª parte (leitura a confirmar): a definição só exige inscrição na OMV; a assistência urgente (6.2) depende de CAMV e a rede P.A.R.A. está em constituição.</w:t>
+              <w:t>1.ª parte: «indelegável» sem regra de substituição; numa operação longa o responsável clínico tem de ser substituível. 2.ª parte (esclarecida em 14.10.2026): pôr a responsabilidade clínica num médico veterinário sem CAMV é inviável. A assistência urgente (6.2) exige instalações, a eutanásia de animais de companhia só pode ser feita em CRO ou CAMV (Lei 27/2016, art. 3.º, n.º 6) e a rede P.A.R.A. está em constituição.</w:t>
             </w:r>
           </w:p>
         </w:tc>
@@ -3955,7 +3955,7 @@
               <w:rPr>
                 <w:sz w:val="17"/>
               </w:rPr>
-              <w:t>A «decisão fundamentada» do DL 142/2006 corresponde, na tabela da própria proposta, a «retirada e destruição» de animais de produção sem rastreabilidade, isto é, occisão. Não se aplica a animais de companhia. Texto do DL 142/2006 não conferido.</w:t>
+              <w:t>A «decisão fundamentada» do DL 142/2006 corresponde, na tabela da própria proposta, a «retirada e destruição» de animais de produção sem rastreabilidade. O n.º 7, no texto original de 2006, permite «determinar a destruição da carcaça ou do animal sem qualquer compensação para o seu detentor»: é occisão, não eutanásia por indicação clínica. Não se aplica a animais de companhia. Redação atual do n.º 7 por conferir.</w:t>
             </w:r>
           </w:p>
         </w:tc>
@@ -4627,7 +4627,7 @@
               <w:rPr>
                 <w:sz w:val="17"/>
               </w:rPr>
-              <w:t>A autorização de transportador vem do DL 265/2007, que executa o Regulamento (CE) n.º 1/2005. Esse regulamento não se aplica ao transporte que não seja feito no âmbito de uma atividade económica (art. 1.º, n.º 5; redação a conferir), como o de animais retirados por autoridades ou associações. Para animais de companhia, o critério vigente é o do DL 276/2001, art. 10.º, n.º 1 (veículos e contentores apropriados à espécie e ao número).</w:t>
+              <w:t>A autorização de transportador vem do DL 265/2007, que executa o Regulamento (CE) n.º 1/2005. Esse regulamento não se aplica ao transporte que não seja feito no âmbito de uma atividade económica nem ao transporte direto para clínicas ou consultórios veterinários por indicação de um médico veterinário (art. 1.º, n.º 5, conferido na versão inglesa adotada), como o de animais retirados por autoridades ou associações. Para animais de companhia, o critério vigente é o do DL 276/2001, art. 10.º, n.º 1 (veículos e contentores apropriados à espécie e ao número).</w:t>
             </w:r>
           </w:p>
         </w:tc>
@@ -5487,7 +5487,7 @@
         <w:spacing w:after="60"/>
       </w:pPr>
       <w:r>
-        <w:t>Não conferidos nesta sessão: Regulamento (CE) n.º 1/2005, art. 1.º, n.º 5, e Regulamento (CE) n.º 1069/2009 (EUR-Lex inacessível a partir do contentor); DL 142/2006, art. 23.º, n.º 7.</w:t>
+        <w:t>Regulamento (CE) n.º 1/2005, art. 1.º, n.º 5, e Regulamento (CE) n.º 1069/2009, arts. 8.º e 19.º: versão inglesa adotada, conferida; versão portuguesa por conferir no EUR-Lex (inacessível a partir do contentor). DL 142/2006, art. 23.º: texto original de 2006 conferido; n.º 1 na redação atual facultado em 14.10.2026.</w:t>
       </w:r>
     </w:p>
     <w:sectPr>

</xml_diff>